<commit_message>
feat: OnlyOffice report preview, fix path duplication bug, improve error logging
- Replace DocxPreviewModal with OnlyOfficeEditorModal for report preview
- Add 'Create & Preview Report in OnlyOffice' button to runs page
- Download button appears after report generation
- Fix path.resolve duplication on Windows in docx-engine (check isAbsolute first)
- Add detailed error logging to export API and runs page
- Improve UX with better button labels and disabled states
</commit_message>
<xml_diff>
--- a/report_assets/Bộ hồ sơ vay vốn doanh nghiệp/Hồ sơ vay vốn/Cong ty TNHH DT TM DV Ut Huy_BCDX cho vay ngan han_2025-12-19.docx
+++ b/report_assets/Bộ hồ sơ vay vốn doanh nghiệp/Hồ sơ vay vốn/Cong ty TNHH DT TM DV Ut Huy_BCDX cho vay ngan han_2025-12-19.docx
@@ -118,7 +118,7 @@
                 </mc:Choice>
                 <mc:Fallback>
                   <w:pict>
-                    <v:line w14:anchorId="18F99310" id="Straight Connector 1" o:spid="_x0000_s1026" style="position:absolute;z-index:251660288;visibility:visible;mso-wrap-style:square;mso-wrap-distance-left:9pt;mso-wrap-distance-top:0;mso-wrap-distance-right:9pt;mso-wrap-distance-bottom:0;mso-position-horizontal:center;mso-position-horizontal-relative:margin;mso-position-vertical:absolute;mso-position-vertical-relative:text" from="0,2.7pt" to="93pt,2.7pt" o:gfxdata="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" strokecolor="black [3040]">
+                    <v:line w14:anchorId="65FB7D50" id="Straight Connector 1" o:spid="_x0000_s1026" style="position:absolute;z-index:251660288;visibility:visible;mso-wrap-style:square;mso-wrap-distance-left:9pt;mso-wrap-distance-top:0;mso-wrap-distance-right:9pt;mso-wrap-distance-bottom:0;mso-position-horizontal:center;mso-position-horizontal-relative:margin;mso-position-vertical:absolute;mso-position-vertical-relative:text" from="0,2.7pt" to="93pt,2.7pt" o:gfxdata="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" strokecolor="black [3040]">
                       <w10:wrap anchorx="margin"/>
                     </v:line>
                   </w:pict>
@@ -239,7 +239,7 @@
                 </mc:Choice>
                 <mc:Fallback>
                   <w:pict>
-                    <v:shapetype w14:anchorId="335744EF" id="_x0000_t32" coordsize="21600,21600" o:spt="32" o:oned="t" path="m,l21600,21600e" filled="f">
+                    <v:shapetype w14:anchorId="4DE4E839" id="_x0000_t32" coordsize="21600,21600" o:spt="32" o:oned="t" path="m,l21600,21600e" filled="f">
                       <v:path arrowok="t" fillok="f" o:connecttype="none"/>
                       <o:lock v:ext="edit" shapetype="t"/>
                     </v:shapetype>
@@ -11211,7 +11211,7 @@
                 <w:sz w:val="26"/>
                 <w:lang w:val="fr-FR"/>
               </w:rPr>
-              <w:t>AA 04012134</w:t>
+              <w:t>AA04012134</w:t>
             </w:r>
           </w:p>
         </w:tc>

</xml_diff>

<commit_message>
refactor: OnlyOffice security hardening, code quality, UI improvements
- Require JWT_SECRET via env var instead of hardcoded default
- Add file token auth for OnlyOffice document access
- Improve error handling (AppError hierarchy, rate limiter)
- Update report build service, field values, placeholder sidebar
- CSS and layout refinements, dark mode improvements
- Remove stale prisma/dev.db artifact
</commit_message>
<xml_diff>
--- a/report_assets/Bộ hồ sơ vay vốn doanh nghiệp/Hồ sơ vay vốn/Cong ty TNHH DT TM DV Ut Huy_BCDX cho vay ngan han_2025-12-19.docx
+++ b/report_assets/Bộ hồ sơ vay vốn doanh nghiệp/Hồ sơ vay vốn/Cong ty TNHH DT TM DV Ut Huy_BCDX cho vay ngan han_2025-12-19.docx
@@ -118,7 +118,7 @@
                 </mc:Choice>
                 <mc:Fallback>
                   <w:pict>
-                    <v:line w14:anchorId="65FB7D50" id="Straight Connector 1" o:spid="_x0000_s1026" style="position:absolute;z-index:251660288;visibility:visible;mso-wrap-style:square;mso-wrap-distance-left:9pt;mso-wrap-distance-top:0;mso-wrap-distance-right:9pt;mso-wrap-distance-bottom:0;mso-position-horizontal:center;mso-position-horizontal-relative:margin;mso-position-vertical:absolute;mso-position-vertical-relative:text" from="0,2.7pt" to="93pt,2.7pt" o:gfxdata="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" strokecolor="black [3040]">
+                    <v:line w14:anchorId="41D17909" id="Straight Connector 1" o:spid="_x0000_s1026" style="position:absolute;z-index:251660288;visibility:visible;mso-wrap-style:square;mso-wrap-distance-left:9pt;mso-wrap-distance-top:0;mso-wrap-distance-right:9pt;mso-wrap-distance-bottom:0;mso-position-horizontal:center;mso-position-horizontal-relative:margin;mso-position-vertical:absolute;mso-position-vertical-relative:text" from="0,2.7pt" to="93pt,2.7pt" o:gfxdata="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" strokecolor="black [3040]">
                       <w10:wrap anchorx="margin"/>
                     </v:line>
                   </w:pict>
@@ -239,7 +239,7 @@
                 </mc:Choice>
                 <mc:Fallback>
                   <w:pict>
-                    <v:shapetype w14:anchorId="4DE4E839" id="_x0000_t32" coordsize="21600,21600" o:spt="32" o:oned="t" path="m,l21600,21600e" filled="f">
+                    <v:shapetype w14:anchorId="3E80D3EB" id="_x0000_t32" coordsize="21600,21600" o:spt="32" o:oned="t" path="m,l21600,21600e" filled="f">
                       <v:path arrowok="t" fillok="f" o:connecttype="none"/>
                       <o:lock v:ext="edit" shapetype="t"/>
                     </v:shapetype>

</xml_diff>